<commit_message>
Renato Aragão: revisão parte 4
Co-Authored-By: Claude Opus 5.5 <noreply@anthropic.com>
Claude-Session: https://claude.ai/code/session_01MJjUEEZrxQDEUifKK2vj9g
</commit_message>
<xml_diff>
--- a/roteiros/renato-aragao/RenatoAragao_Parte4.docx
+++ b/roteiros/renato-aragao/RenatoAragao_Parte4.docx
@@ -71,7 +71,7 @@
         <w:rPr>
           <w:color w:val="C00000"/>
         </w:rPr>
-        <w:t>Guarde isto na sua cabeça. Nas gravações do documentário, pessoas que conviveram com o grupo falam de piadas, de apelidos e de atitudes nos bastidores que envolviam justamente esses dois homens. Um negro. E um gay que nunca se assumiu. E o que elas contam ajuda a entender o peso da frase que você ainda vai ouvir.</w:t>
+        <w:t>Guarde isto na sua cabeça. Nas gravações do documentário, pessoas que conviveram com o grupo falam de piadas e de atitudes nos bastidores que envolviam justamente esses dois homens. E o que elas contam ajuda a entender o peso da frase que você ainda vai ouvir.</w:t>
       </w:r>
     </w:p>
     <w:p>
@@ -159,7 +159,7 @@
         <w:rPr>
           <w:color w:val="000000"/>
         </w:rPr>
-        <w:t>Enquanto isso, Mussum também carregava um problema que o público não via.</w:t>
+        <w:t>Mussum também carregava um problema que o público não via.</w:t>
       </w:r>
     </w:p>
     <w:p>
@@ -183,14 +183,6 @@
         <w:rPr>
           <w:color w:val="000000"/>
         </w:rPr>
-        <w:t>Mesmo doente, ele continuou gravando e fazendo o país rir. O coração, porém, ia ficando cada vez mais fraco.</w:t>
-      </w:r>
-    </w:p>
-    <w:p>
-      <w:r>
-        <w:rPr>
-          <w:color w:val="000000"/>
-        </w:rPr>
         <w:t>O público via o Mussum de sempre, o dos bordões terminados em "is".</w:t>
       </w:r>
     </w:p>
@@ -199,7 +191,7 @@
         <w:rPr>
           <w:color w:val="000000"/>
         </w:rPr>
-        <w:t>Por dentro, o homem estava se apagando.</w:t>
+        <w:t>Por dentro, o coração estava perdendo força.</w:t>
       </w:r>
     </w:p>
     <w:p>
@@ -207,7 +199,7 @@
         <w:rPr>
           <w:color w:val="C00000"/>
         </w:rPr>
-        <w:t>Imagine por um momento o que era estar naquele estúdio. Dois dos quatro Trapalhões doentes, cada um do seu jeito, enquanto as câmeras continuavam ligadas e o programa seguia como se nada estivesse acontecendo. O que veio a seguir aconteceu em dois golpes. E o segundo foi ainda mais cruel que o primeiro.</w:t>
+        <w:t>Imagine por um momento fazer parte daquele grupo e ver, em poucos anos, dois companheiros de palco adoecerem longe dos olhos do público. O que veio a seguir aconteceu em dois golpes. E o segundo foi ainda mais cruel que o primeiro.</w:t>
       </w:r>
     </w:p>
     <w:p>
@@ -335,7 +327,7 @@
         <w:rPr>
           <w:color w:val="1F4EB4"/>
         </w:rPr>
-        <w:t>Tinha cinquenta e três anos. Foi enterrado no Cemitério do Congonhas, em São Paulo.</w:t>
+        <w:t>Tinha cinquenta e três anos. Foi enterrado no Cemitério Congonhas, em São Paulo.</w:t>
       </w:r>
     </w:p>
     <w:p>

</xml_diff>